<commit_message>
updated the project description
</commit_message>
<xml_diff>
--- a/e-omix web - text content.docx
+++ b/e-omix web - text content.docx
@@ -1,6 +1,6 @@
 
 <file path=word/document.xml><?xml version="1.0" encoding="utf-8"?>
-<w:document xmlns:wpc="http://schemas.microsoft.com/office/word/2010/wordprocessingCanvas" xmlns:cx="http://schemas.microsoft.com/office/drawing/2014/chartex" xmlns:cx1="http://schemas.microsoft.com/office/drawing/2015/9/8/chartex" xmlns:cx2="http://schemas.microsoft.com/office/drawing/2015/10/21/chartex" xmlns:cx3="http://schemas.microsoft.com/office/drawing/2016/5/9/chartex" xmlns:cx4="http://schemas.microsoft.com/office/drawing/2016/5/10/chartex" xmlns:cx5="http://schemas.microsoft.com/office/drawing/2016/5/11/chartex" xmlns:cx6="http://schemas.microsoft.com/office/drawing/2016/5/12/chartex" xmlns:cx7="http://schemas.microsoft.com/office/drawing/2016/5/13/chartex" xmlns:cx8="http://schemas.microsoft.com/office/drawing/2016/5/14/chartex" xmlns:mc="http://schemas.openxmlformats.org/markup-compatibility/2006" xmlns:aink="http://schemas.microsoft.com/office/drawing/2016/ink" xmlns:am3d="http://schemas.microsoft.com/office/drawing/2017/model3d" xmlns:o="urn:schemas-microsoft-com:office:office" xmlns:oel="http://schemas.microsoft.com/office/2019/extlst" xmlns:r="http://schemas.openxmlformats.org/officeDocument/2006/relationships" xmlns:m="http://schemas.openxmlformats.org/officeDocument/2006/math" xmlns:v="urn:schemas-microsoft-com:vml" xmlns:wp14="http://schemas.microsoft.com/office/word/2010/wordprocessingDrawing" xmlns:wp="http://schemas.openxmlformats.org/drawingml/2006/wordprocessingDrawing" xmlns:w10="urn:schemas-microsoft-com:office:word" xmlns:w="http://schemas.openxmlformats.org/wordprocessingml/2006/main" xmlns:w14="http://schemas.microsoft.com/office/word/2010/wordml" xmlns:w15="http://schemas.microsoft.com/office/word/2012/wordml" xmlns:w16cex="http://schemas.microsoft.com/office/word/2018/wordml/cex" xmlns:w16cid="http://schemas.microsoft.com/office/word/2016/wordml/cid" xmlns:w16="http://schemas.microsoft.com/office/word/2018/wordml" xmlns:w16sdtdh="http://schemas.microsoft.com/office/word/2020/wordml/sdtdatahash" xmlns:w16se="http://schemas.microsoft.com/office/word/2015/wordml/symex" xmlns:wpg="http://schemas.microsoft.com/office/word/2010/wordprocessingGroup" xmlns:wpi="http://schemas.microsoft.com/office/word/2010/wordprocessingInk" xmlns:wne="http://schemas.microsoft.com/office/word/2006/wordml" xmlns:wps="http://schemas.microsoft.com/office/word/2010/wordprocessingShape" mc:Ignorable="w14 w15 w16se w16cid w16 w16cex w16sdtdh wp14">
+<w:document xmlns:wpc="http://schemas.microsoft.com/office/word/2010/wordprocessingCanvas" xmlns:cx="http://schemas.microsoft.com/office/drawing/2014/chartex" xmlns:cx1="http://schemas.microsoft.com/office/drawing/2015/9/8/chartex" xmlns:cx2="http://schemas.microsoft.com/office/drawing/2015/10/21/chartex" xmlns:cx3="http://schemas.microsoft.com/office/drawing/2016/5/9/chartex" xmlns:cx4="http://schemas.microsoft.com/office/drawing/2016/5/10/chartex" xmlns:cx5="http://schemas.microsoft.com/office/drawing/2016/5/11/chartex" xmlns:cx6="http://schemas.microsoft.com/office/drawing/2016/5/12/chartex" xmlns:cx7="http://schemas.microsoft.com/office/drawing/2016/5/13/chartex" xmlns:cx8="http://schemas.microsoft.com/office/drawing/2016/5/14/chartex" xmlns:mc="http://schemas.openxmlformats.org/markup-compatibility/2006" xmlns:aink="http://schemas.microsoft.com/office/drawing/2016/ink" xmlns:am3d="http://schemas.microsoft.com/office/drawing/2017/model3d" xmlns:o="urn:schemas-microsoft-com:office:office" xmlns:oel="http://schemas.microsoft.com/office/2019/extlst" xmlns:r="http://schemas.openxmlformats.org/officeDocument/2006/relationships" xmlns:m="http://schemas.openxmlformats.org/officeDocument/2006/math" xmlns:v="urn:schemas-microsoft-com:vml" xmlns:wp14="http://schemas.microsoft.com/office/word/2010/wordprocessingDrawing" xmlns:wp="http://schemas.openxmlformats.org/drawingml/2006/wordprocessingDrawing" xmlns:w10="urn:schemas-microsoft-com:office:word" xmlns:w="http://schemas.openxmlformats.org/wordprocessingml/2006/main" xmlns:w14="http://schemas.microsoft.com/office/word/2010/wordml" xmlns:w15="http://schemas.microsoft.com/office/word/2012/wordml" xmlns:w16cex="http://schemas.microsoft.com/office/word/2018/wordml/cex" xmlns:w16cid="http://schemas.microsoft.com/office/word/2016/wordml/cid" xmlns:w16="http://schemas.microsoft.com/office/word/2018/wordml" xmlns:w16du="http://schemas.microsoft.com/office/word/2023/wordml/word16du" xmlns:w16sdtdh="http://schemas.microsoft.com/office/word/2020/wordml/sdtdatahash" xmlns:w16sdtfl="http://schemas.microsoft.com/office/word/2024/wordml/sdtformatlock" xmlns:w16se="http://schemas.microsoft.com/office/word/2015/wordml/symex" xmlns:wpg="http://schemas.microsoft.com/office/word/2010/wordprocessingGroup" xmlns:wpi="http://schemas.microsoft.com/office/word/2010/wordprocessingInk" xmlns:wne="http://schemas.microsoft.com/office/word/2006/wordml" xmlns:wps="http://schemas.microsoft.com/office/word/2010/wordprocessingShape" mc:Ignorable="w14 w15 w16se w16cid w16 w16cex w16sdtdh w16sdtfl w16du wp14">
   <w:body>
     <w:p>
       <w:pPr>
@@ -13,42 +13,73 @@
         <w:rPr>
           <w:lang w:val="en-US"/>
         </w:rPr>
-        <w:t xml:space="preserve">Biography L. </w:t>
+        <w:t>Biography L. Gatto</w:t>
+      </w:r>
+    </w:p>
+    <w:p>
+      <w:pPr>
+        <w:rPr>
+          <w:lang w:val="en-US"/>
+        </w:rPr>
+      </w:pPr>
+      <w:r>
+        <w:rPr>
+          <w:lang w:val="en-US"/>
+        </w:rPr>
+        <w:t>Laurent Gatto is the</w:t>
+      </w:r>
+      <w:r>
+        <w:rPr>
+          <w:lang w:val="en-US"/>
+        </w:rPr>
+        <w:t xml:space="preserve"> </w:t>
+      </w:r>
+      <w:r>
+        <w:rPr>
+          <w:lang w:val="en-US"/>
+        </w:rPr>
+        <w:t xml:space="preserve">head of the CBIO group at UCLouvain and teaches bioinformatics in the </w:t>
       </w:r>
       <w:proofErr w:type="spellStart"/>
       <w:r>
         <w:rPr>
           <w:lang w:val="en-US"/>
         </w:rPr>
-        <w:t>Gatto</w:t>
+        <w:t>Facutly</w:t>
       </w:r>
       <w:proofErr w:type="spellEnd"/>
-    </w:p>
-    <w:p>
-      <w:pPr>
-        <w:rPr>
-          <w:lang w:val="en-US"/>
-        </w:rPr>
-      </w:pPr>
-      <w:r>
-        <w:rPr>
-          <w:lang w:val="en-US"/>
-        </w:rPr>
-        <w:t xml:space="preserve">Laurent </w:t>
-      </w:r>
-      <w:proofErr w:type="spellStart"/>
-      <w:r>
-        <w:rPr>
-          <w:lang w:val="en-US"/>
-        </w:rPr>
-        <w:t>Gatto</w:t>
-      </w:r>
-      <w:proofErr w:type="spellEnd"/>
-      <w:r>
-        <w:rPr>
-          <w:lang w:val="en-US"/>
-        </w:rPr>
-        <w:t xml:space="preserve"> is the</w:t>
+      <w:r>
+        <w:rPr>
+          <w:lang w:val="en-US"/>
+        </w:rPr>
+        <w:t xml:space="preserve"> of Pharmacy and Biomedical Sciences (FASB).</w:t>
+      </w:r>
+    </w:p>
+    <w:p>
+      <w:pPr>
+        <w:pStyle w:val="Titre1"/>
+        <w:rPr>
+          <w:lang w:val="en-US"/>
+        </w:rPr>
+      </w:pPr>
+      <w:r>
+        <w:rPr>
+          <w:lang w:val="en-US"/>
+        </w:rPr>
+        <w:t xml:space="preserve">Biography S. Jodogne </w:t>
+      </w:r>
+    </w:p>
+    <w:p>
+      <w:pPr>
+        <w:rPr>
+          <w:lang w:val="en-US"/>
+        </w:rPr>
+      </w:pPr>
+      <w:r>
+        <w:rPr>
+          <w:lang w:val="en-US"/>
+        </w:rPr>
+        <w:t>Sébastien Jodogne is Professor of Computer Science applied to Life Sciences at UCLouvain. An expert in e-Health, he is particularly active in the fields of medical imaging, image analysis and patient education.</w:t>
       </w:r>
       <w:r>
         <w:rPr>
@@ -56,50 +87,6 @@
         </w:rPr>
         <w:t xml:space="preserve"> </w:t>
       </w:r>
-      <w:r>
-        <w:rPr>
-          <w:lang w:val="en-US"/>
-        </w:rPr>
-        <w:t xml:space="preserve">head of the </w:t>
-      </w:r>
-      <w:r>
-        <w:rPr>
-          <w:lang w:val="en-US"/>
-        </w:rPr>
-        <w:t xml:space="preserve">CBIO </w:t>
-      </w:r>
-      <w:r>
-        <w:rPr>
-          <w:lang w:val="en-US"/>
-        </w:rPr>
-        <w:t>group</w:t>
-      </w:r>
-      <w:r>
-        <w:rPr>
-          <w:lang w:val="en-US"/>
-        </w:rPr>
-        <w:t xml:space="preserve"> at UCLouvain</w:t>
-      </w:r>
-      <w:r>
-        <w:rPr>
-          <w:lang w:val="en-US"/>
-        </w:rPr>
-        <w:t xml:space="preserve"> and teaches bioinformatics in the </w:t>
-      </w:r>
-      <w:proofErr w:type="spellStart"/>
-      <w:r>
-        <w:rPr>
-          <w:lang w:val="en-US"/>
-        </w:rPr>
-        <w:t>Facutly</w:t>
-      </w:r>
-      <w:proofErr w:type="spellEnd"/>
-      <w:r>
-        <w:rPr>
-          <w:lang w:val="en-US"/>
-        </w:rPr>
-        <w:t xml:space="preserve"> of Pharmacy and Biomedical Sciences (FASB).</w:t>
-      </w:r>
     </w:p>
     <w:p>
       <w:pPr>
@@ -112,67 +99,6 @@
         <w:rPr>
           <w:lang w:val="en-US"/>
         </w:rPr>
-        <w:t xml:space="preserve">Biography S. </w:t>
-      </w:r>
-      <w:proofErr w:type="spellStart"/>
-      <w:r>
-        <w:rPr>
-          <w:lang w:val="en-US"/>
-        </w:rPr>
-        <w:t>Jodogne</w:t>
-      </w:r>
-      <w:proofErr w:type="spellEnd"/>
-      <w:r>
-        <w:rPr>
-          <w:lang w:val="en-US"/>
-        </w:rPr>
-        <w:t xml:space="preserve"> </w:t>
-      </w:r>
-    </w:p>
-    <w:p>
-      <w:pPr>
-        <w:rPr>
-          <w:lang w:val="en-US"/>
-        </w:rPr>
-      </w:pPr>
-      <w:r>
-        <w:rPr>
-          <w:lang w:val="en-US"/>
-        </w:rPr>
-        <w:t xml:space="preserve">Sébastien </w:t>
-      </w:r>
-      <w:proofErr w:type="spellStart"/>
-      <w:r>
-        <w:rPr>
-          <w:lang w:val="en-US"/>
-        </w:rPr>
-        <w:t>Jodogne</w:t>
-      </w:r>
-      <w:proofErr w:type="spellEnd"/>
-      <w:r>
-        <w:rPr>
-          <w:lang w:val="en-US"/>
-        </w:rPr>
-        <w:t xml:space="preserve"> is Professor of Computer Science applied to Life Sciences at UCLouvain. An expert in e-Health, he is particularly active in the fields of medical imaging, image analysis and patient education.</w:t>
-      </w:r>
-      <w:r>
-        <w:rPr>
-          <w:lang w:val="en-US"/>
-        </w:rPr>
-        <w:t xml:space="preserve"> </w:t>
-      </w:r>
-    </w:p>
-    <w:p>
-      <w:pPr>
-        <w:pStyle w:val="Titre1"/>
-        <w:rPr>
-          <w:lang w:val="en-US"/>
-        </w:rPr>
-      </w:pPr>
-      <w:r>
-        <w:rPr>
-          <w:lang w:val="en-US"/>
-        </w:rPr>
         <w:t xml:space="preserve">e-OMIX </w:t>
       </w:r>
       <w:r>
@@ -338,14 +264,7 @@
           <w:shd w:val="clear" w:color="auto" w:fill="F7F7F8"/>
           <w:lang w:val="en-US"/>
         </w:rPr>
-        <w:t xml:space="preserve">e-OMIX strives </w:t>
-      </w:r>
-      <w:r>
-        <w:rPr>
-          <w:shd w:val="clear" w:color="auto" w:fill="F7F7F8"/>
-          <w:lang w:val="en-US"/>
-        </w:rPr>
-        <w:t>to overcome these obstacles b</w:t>
+        <w:t>e-OMIX strives to overcome these obstacles b</w:t>
       </w:r>
       <w:r>
         <w:rPr>
@@ -1512,6 +1431,246 @@
           <w:lang w:val="en-US"/>
         </w:rPr>
         <w:t xml:space="preserve"> new biomarkers, and facilitate therapeutic developments.</w:t>
+      </w:r>
+    </w:p>
+    <w:p>
+      <w:pPr>
+        <w:rPr>
+          <w:shd w:val="clear" w:color="auto" w:fill="F7F7F8"/>
+          <w:lang w:val="en-US"/>
+        </w:rPr>
+      </w:pPr>
+    </w:p>
+    <w:p>
+      <w:pPr>
+        <w:pStyle w:val="Titre1"/>
+        <w:rPr>
+          <w:shd w:val="clear" w:color="auto" w:fill="F7F7F8"/>
+          <w:lang w:val="en-US"/>
+        </w:rPr>
+      </w:pPr>
+      <w:r>
+        <w:rPr>
+          <w:shd w:val="clear" w:color="auto" w:fill="F7F7F8"/>
+          <w:lang w:val="en-US"/>
+        </w:rPr>
+        <w:t>e-OMIX project</w:t>
+      </w:r>
+    </w:p>
+    <w:p>
+      <w:pPr>
+        <w:rPr>
+          <w:lang w:val="en-US"/>
+        </w:rPr>
+      </w:pPr>
+    </w:p>
+    <w:p>
+      <w:pPr>
+        <w:rPr>
+          <w:lang w:val="en-US"/>
+        </w:rPr>
+      </w:pPr>
+      <w:r>
+        <w:rPr>
+          <w:lang w:val="en-US"/>
+        </w:rPr>
+        <w:t xml:space="preserve">e-OMIX aims to offer a solution for the analysis management and exploration of omics data through </w:t>
+      </w:r>
+      <w:proofErr w:type="gramStart"/>
+      <w:r>
+        <w:rPr>
+          <w:lang w:val="en-US"/>
+        </w:rPr>
+        <w:t>an</w:t>
+      </w:r>
+      <w:proofErr w:type="gramEnd"/>
+      <w:r>
+        <w:rPr>
+          <w:lang w:val="en-US"/>
+        </w:rPr>
+        <w:t xml:space="preserve"> user-friendly interface.</w:t>
+      </w:r>
+    </w:p>
+    <w:p>
+      <w:pPr>
+        <w:rPr>
+          <w:lang w:val="en-US"/>
+        </w:rPr>
+      </w:pPr>
+    </w:p>
+    <w:p>
+      <w:pPr>
+        <w:rPr>
+          <w:lang w:val="en-US"/>
+        </w:rPr>
+      </w:pPr>
+      <w:r>
+        <w:rPr>
+          <w:lang w:val="en-US"/>
+        </w:rPr>
+        <w:t>Metadata management and standardization.</w:t>
+      </w:r>
+    </w:p>
+    <w:p>
+      <w:pPr>
+        <w:rPr>
+          <w:lang w:val="en-US"/>
+        </w:rPr>
+      </w:pPr>
+    </w:p>
+    <w:p>
+      <w:pPr>
+        <w:rPr>
+          <w:lang w:val="en-US"/>
+        </w:rPr>
+      </w:pPr>
+      <w:r>
+        <w:rPr>
+          <w:lang w:val="en-US"/>
+        </w:rPr>
+        <w:t xml:space="preserve">Metadata are a crucial element of any omics experiments. They provide essential elements for contrasting analysis and control of experimental variation (e.g., batch corrections). Metadata lacks the standardization and often comes as flat tables, with no </w:t>
+      </w:r>
+      <w:proofErr w:type="spellStart"/>
+      <w:proofErr w:type="gramStart"/>
+      <w:r>
+        <w:rPr>
+          <w:lang w:val="en-US"/>
+        </w:rPr>
+        <w:t>uniforme</w:t>
+      </w:r>
+      <w:proofErr w:type="spellEnd"/>
+      <w:r>
+        <w:rPr>
+          <w:lang w:val="en-US"/>
+        </w:rPr>
+        <w:t xml:space="preserve">  </w:t>
+      </w:r>
+      <w:r>
+        <w:rPr>
+          <w:lang w:val="en-US"/>
+        </w:rPr>
+        <w:lastRenderedPageBreak/>
+        <w:t>structure</w:t>
+      </w:r>
+      <w:proofErr w:type="gramEnd"/>
+      <w:r>
+        <w:rPr>
+          <w:lang w:val="en-US"/>
+        </w:rPr>
+        <w:t xml:space="preserve">. e-OMIX </w:t>
+      </w:r>
+      <w:r>
+        <w:rPr>
+          <w:lang w:val="en-US"/>
+        </w:rPr>
+        <w:t xml:space="preserve">address this limitation by providing a metadata standardization tool that allow to transform flat-table metadata into standardized, structure format to facilitate exchange and comparisons of experiments. In the </w:t>
+      </w:r>
+      <w:proofErr w:type="gramStart"/>
+      <w:r>
+        <w:rPr>
+          <w:lang w:val="en-US"/>
+        </w:rPr>
+        <w:t>back-end</w:t>
+      </w:r>
+      <w:proofErr w:type="gramEnd"/>
+      <w:r>
+        <w:rPr>
+          <w:lang w:val="en-US"/>
+        </w:rPr>
+        <w:t>, the metadata standardization features harness HL7 FHIR©, a standard format in healthcare industries that aligns it with all the current practices in the field.</w:t>
+      </w:r>
+    </w:p>
+    <w:p>
+      <w:pPr>
+        <w:rPr>
+          <w:lang w:val="en-US"/>
+        </w:rPr>
+      </w:pPr>
+    </w:p>
+    <w:p>
+      <w:pPr>
+        <w:rPr>
+          <w:lang w:val="en-US"/>
+        </w:rPr>
+      </w:pPr>
+    </w:p>
+    <w:p>
+      <w:pPr>
+        <w:rPr>
+          <w:lang w:val="en-US"/>
+        </w:rPr>
+      </w:pPr>
+      <w:r>
+        <w:rPr>
+          <w:lang w:val="en-US"/>
+        </w:rPr>
+        <w:t>End-to-end pipelines</w:t>
+      </w:r>
+    </w:p>
+    <w:p>
+      <w:pPr>
+        <w:rPr>
+          <w:lang w:val="en-US"/>
+        </w:rPr>
+      </w:pPr>
+    </w:p>
+    <w:p>
+      <w:pPr>
+        <w:rPr>
+          <w:lang w:val="en-US"/>
+        </w:rPr>
+      </w:pPr>
+      <w:r>
+        <w:rPr>
+          <w:lang w:val="en-US"/>
+        </w:rPr>
+        <w:t>e-OMIX provides a solution for bench</w:t>
+      </w:r>
+      <w:r>
+        <w:rPr>
+          <w:lang w:val="en-US"/>
+        </w:rPr>
+        <w:t xml:space="preserve"> biologist to perform routine analyses, without the need of programming language. Our platform offers solutions to transform raw RNA sequencing results into count matrices through a click-button interface. Counts matrices can later be processed with customizable filters.</w:t>
+      </w:r>
+    </w:p>
+    <w:p>
+      <w:pPr>
+        <w:rPr>
+          <w:lang w:val="en-US"/>
+        </w:rPr>
+      </w:pPr>
+    </w:p>
+    <w:p>
+      <w:pPr>
+        <w:rPr>
+          <w:lang w:val="en-US"/>
+        </w:rPr>
+      </w:pPr>
+      <w:r>
+        <w:rPr>
+          <w:lang w:val="en-US"/>
+        </w:rPr>
+        <w:t>Exploration of omics data</w:t>
+      </w:r>
+    </w:p>
+    <w:p>
+      <w:pPr>
+        <w:rPr>
+          <w:lang w:val="en-US"/>
+        </w:rPr>
+      </w:pPr>
+    </w:p>
+    <w:p>
+      <w:pPr>
+        <w:rPr>
+          <w:lang w:val="en-US"/>
+        </w:rPr>
+      </w:pPr>
+      <w:r>
+        <w:rPr>
+          <w:lang w:val="en-US"/>
+        </w:rPr>
+        <w:t xml:space="preserve">Post-analysis data can be explored with a series of interactive tools that allows user to get the biological insight from their data. All plots can be exported in a publication-ready format.  </w:t>
       </w:r>
     </w:p>
     <w:p>
@@ -1539,7 +1698,7 @@
 </file>
 
 <file path=word/styles.xml><?xml version="1.0" encoding="utf-8"?>
-<w:styles xmlns:mc="http://schemas.openxmlformats.org/markup-compatibility/2006" xmlns:r="http://schemas.openxmlformats.org/officeDocument/2006/relationships" xmlns:w="http://schemas.openxmlformats.org/wordprocessingml/2006/main" xmlns:w14="http://schemas.microsoft.com/office/word/2010/wordml" xmlns:w15="http://schemas.microsoft.com/office/word/2012/wordml" xmlns:w16cex="http://schemas.microsoft.com/office/word/2018/wordml/cex" xmlns:w16cid="http://schemas.microsoft.com/office/word/2016/wordml/cid" xmlns:w16="http://schemas.microsoft.com/office/word/2018/wordml" xmlns:w16sdtdh="http://schemas.microsoft.com/office/word/2020/wordml/sdtdatahash" xmlns:w16se="http://schemas.microsoft.com/office/word/2015/wordml/symex" mc:Ignorable="w14 w15 w16se w16cid w16 w16cex w16sdtdh">
+<w:styles xmlns:mc="http://schemas.openxmlformats.org/markup-compatibility/2006" xmlns:r="http://schemas.openxmlformats.org/officeDocument/2006/relationships" xmlns:w="http://schemas.openxmlformats.org/wordprocessingml/2006/main" xmlns:w14="http://schemas.microsoft.com/office/word/2010/wordml" xmlns:w15="http://schemas.microsoft.com/office/word/2012/wordml" xmlns:w16cex="http://schemas.microsoft.com/office/word/2018/wordml/cex" xmlns:w16cid="http://schemas.microsoft.com/office/word/2016/wordml/cid" xmlns:w16="http://schemas.microsoft.com/office/word/2018/wordml" xmlns:w16du="http://schemas.microsoft.com/office/word/2023/wordml/word16du" xmlns:w16sdtdh="http://schemas.microsoft.com/office/word/2020/wordml/sdtdatahash" xmlns:w16sdtfl="http://schemas.microsoft.com/office/word/2024/wordml/sdtformatlock" xmlns:w16se="http://schemas.microsoft.com/office/word/2015/wordml/symex" mc:Ignorable="w14 w15 w16se w16cid w16 w16cex w16sdtdh w16sdtfl w16du">
   <w:docDefaults>
     <w:rPrDefault>
       <w:rPr>

</xml_diff>